<commit_message>
Update DOCX documentation files to reflect enhancement completion
- PAS_GAP_ANALYSIS_REPORT.docx: Update page count (26→34), component
  count (50→55+), endpoint count (161→180+), route modules (18→24+),
  add 6 new module rows (Service Desk, DDE, Finance, Servicing,
  Master Setup, Audit Logs)
- IMGC_PAS_Application_Guide.docx: Add 6 new module sections
  (15-20: Service Desk QDE, DDE, Finance, Servicing, Master Setup,
  Audit Logs), renumber existing sections 15-18 to 21-24, update
  TOC, update module count (14→20+)

Co-Authored-By: Claude Opus 4.6 <noreply@anthropic.com>
</commit_message>
<xml_diff>
--- a/docs/IMGC_PAS_Application_Guide.docx
+++ b/docs/IMGC_PAS_Application_Guide.docx
@@ -363,7 +363,67 @@
           <w:color w:val="F59E0B"/>
           <w:sz w:val="22"/>
         </w:rPr>
-        <w:t xml:space="preserve">15.  </w:t>
+        <w:t xml:space="preserve">15.  Service Desk (QDE)</w:t>
+      </w:r>
+    </w:p>
+    <w:p>
+      <w:r>
+        <w:rPr>
+          <w:b/>
+          <w:color w:val="F59E0B"/>
+          <w:sz w:val="22"/>
+        </w:rPr>
+        <w:t xml:space="preserve">16.  DDE (Detailed Data Entry)</w:t>
+      </w:r>
+    </w:p>
+    <w:p>
+      <w:r>
+        <w:rPr>
+          <w:b/>
+          <w:color w:val="F59E0B"/>
+          <w:sz w:val="22"/>
+        </w:rPr>
+        <w:t xml:space="preserve">17.  Finance</w:t>
+      </w:r>
+    </w:p>
+    <w:p>
+      <w:r>
+        <w:rPr>
+          <w:b/>
+          <w:color w:val="F59E0B"/>
+          <w:sz w:val="22"/>
+        </w:rPr>
+        <w:t xml:space="preserve">18.  Servicing</w:t>
+      </w:r>
+    </w:p>
+    <w:p>
+      <w:r>
+        <w:rPr>
+          <w:b/>
+          <w:color w:val="F59E0B"/>
+          <w:sz w:val="22"/>
+        </w:rPr>
+        <w:t xml:space="preserve">19.  Master Setup</w:t>
+      </w:r>
+    </w:p>
+    <w:p>
+      <w:r>
+        <w:rPr>
+          <w:b/>
+          <w:color w:val="F59E0B"/>
+          <w:sz w:val="22"/>
+        </w:rPr>
+        <w:t xml:space="preserve">20.  Audit Logs</w:t>
+      </w:r>
+    </w:p>
+    <w:p>
+      <w:r>
+        <w:rPr>
+          <w:b/>
+          <w:color w:val="F59E0B"/>
+          <w:sz w:val="22"/>
+        </w:rPr>
+        <w:t xml:space="preserve">21.  </w:t>
       </w:r>
       <w:r>
         <w:rPr>
@@ -380,7 +440,7 @@
           <w:color w:val="F59E0B"/>
           <w:sz w:val="22"/>
         </w:rPr>
-        <w:t xml:space="preserve">16.  </w:t>
+        <w:t xml:space="preserve">22.  </w:t>
       </w:r>
       <w:r>
         <w:rPr>
@@ -397,7 +457,7 @@
           <w:color w:val="F59E0B"/>
           <w:sz w:val="22"/>
         </w:rPr>
-        <w:t xml:space="preserve">17.  </w:t>
+        <w:t xml:space="preserve">23.  </w:t>
       </w:r>
       <w:r>
         <w:rPr>
@@ -414,7 +474,7 @@
           <w:color w:val="F59E0B"/>
           <w:sz w:val="22"/>
         </w:rPr>
-        <w:t xml:space="preserve">18.  </w:t>
+        <w:t xml:space="preserve">24.  </w:t>
       </w:r>
       <w:r>
         <w:rPr>
@@ -1033,7 +1093,7 @@
     </w:p>
     <w:p>
       <w:r>
-        <w:t>The login page displays three compliance indicators: 256-bit encrypted, SOC 2 compliant, and IRDAI regulated. Platform statistics are shown — 14+ Modules, 150+ API Endpoints, and 5 User Roles.</w:t>
+        <w:t>The login page displays three compliance indicators: 256-bit encrypted, SOC 2 compliant, and IRDAI regulated. Platform statistics are shown — 20+ Modules, 150+ API Endpoints, and 5 User Roles.</w:t>
       </w:r>
     </w:p>
     <w:p>
@@ -8170,7 +8230,683 @@
         <w:pStyle w:val="Heading1"/>
       </w:pPr>
       <w:r>
-        <w:t>15. Technology Stack &amp; Architecture</w:t>
+        <w:t xml:space="preserve">15. Service Desk (QDE)</w:t>
+      </w:r>
+    </w:p>
+    <w:p>
+      <w:r>
+        <w:t xml:space="preserve"/>
+      </w:r>
+    </w:p>
+    <w:p>
+      <w:pPr>
+        <w:pStyle w:val="Heading2"/>
+      </w:pPr>
+      <w:r>
+        <w:t xml:space="preserve">Overview</w:t>
+      </w:r>
+    </w:p>
+    <w:p>
+      <w:r>
+        <w:t xml:space="preserve">The Service Desk module provides Quick Data Entry (QDE) for new loan/guarantee applications. It features a multi-step wizard for capturing applicant and loan information, auto-allocation of applications to underwriters, and a searchable application queue.</w:t>
+      </w:r>
+    </w:p>
+    <w:p>
+      <w:pPr>
+        <w:pStyle w:val="Heading3"/>
+      </w:pPr>
+      <w:r>
+        <w:t xml:space="preserve">Key Features</w:t>
+      </w:r>
+    </w:p>
+    <w:p>
+      <w:pPr>
+        <w:pStyle w:val="ListBullet"/>
+        <w:spacing w:after="60"/>
+      </w:pPr>
+      <w:r>
+        <w:rPr>
+          <w:rFonts w:ascii="Calibri" w:hAnsi="Calibri"/>
+          <w:sz w:val="20"/>
+        </w:rPr>
+        <w:t xml:space="preserve">5-step application wizard: Loan Basic → Applicant Details → Loan Characteristics → Obligations → Verification</w:t>
+      </w:r>
+    </w:p>
+    <w:p>
+      <w:pPr>
+        <w:pStyle w:val="ListBullet"/>
+        <w:spacing w:after="60"/>
+      </w:pPr>
+      <w:r>
+        <w:rPr>
+          <w:rFonts w:ascii="Calibri" w:hAnsi="Calibri"/>
+          <w:sz w:val="20"/>
+        </w:rPr>
+        <w:t xml:space="preserve">Auto-allocation engine for assigning applications to underwriters</w:t>
+      </w:r>
+    </w:p>
+    <w:p>
+      <w:pPr>
+        <w:pStyle w:val="ListBullet"/>
+        <w:spacing w:after="60"/>
+      </w:pPr>
+      <w:r>
+        <w:rPr>
+          <w:rFonts w:ascii="Calibri" w:hAnsi="Calibri"/>
+          <w:sz w:val="20"/>
+        </w:rPr>
+        <w:t xml:space="preserve">QDE search with status, lender, and date filters</w:t>
+      </w:r>
+    </w:p>
+    <w:p>
+      <w:pPr>
+        <w:pStyle w:val="ListBullet"/>
+        <w:spacing w:after="60"/>
+      </w:pPr>
+      <w:r>
+        <w:rPr>
+          <w:rFonts w:ascii="Calibri" w:hAnsi="Calibri"/>
+          <w:sz w:val="20"/>
+        </w:rPr>
+        <w:t xml:space="preserve">User dashboard showing personal queue and pending items</w:t>
+      </w:r>
+    </w:p>
+    <w:p>
+      <w:pPr>
+        <w:pStyle w:val="ListBullet"/>
+        <w:spacing w:after="60"/>
+      </w:pPr>
+      <w:r>
+        <w:rPr>
+          <w:rFonts w:ascii="Calibri" w:hAnsi="Calibri"/>
+          <w:sz w:val="20"/>
+        </w:rPr>
+        <w:t xml:space="preserve">Draft auto-save with timestamp indicator</w:t>
+      </w:r>
+    </w:p>
+    <w:p>
+      <w:pPr>
+        <w:pStyle w:val="ListBullet"/>
+        <w:spacing w:after="60"/>
+      </w:pPr>
+      <w:r>
+        <w:rPr>
+          <w:rFonts w:ascii="Calibri" w:hAnsi="Calibri"/>
+          <w:sz w:val="20"/>
+        </w:rPr>
+        <w:t xml:space="preserve">Visual workflow progress bar: QDE → DDE → Underwriting → Decision → Issuance</w:t>
+      </w:r>
+    </w:p>
+    <w:p>
+      <w:r>
+        <w:t xml:space="preserve"/>
+      </w:r>
+    </w:p>
+    <w:p>
+      <w:pPr>
+        <w:pStyle w:val="Heading1"/>
+      </w:pPr>
+      <w:r>
+        <w:t xml:space="preserve">16. DDE (Detailed Data Entry)</w:t>
+      </w:r>
+    </w:p>
+    <w:p>
+      <w:r>
+        <w:t xml:space="preserve"/>
+      </w:r>
+    </w:p>
+    <w:p>
+      <w:pPr>
+        <w:pStyle w:val="Heading2"/>
+      </w:pPr>
+      <w:r>
+        <w:t xml:space="preserve">Overview</w:t>
+      </w:r>
+    </w:p>
+    <w:p>
+      <w:r>
+        <w:t xml:space="preserve">The DDE module provides a comprehensive workspace for detailed data entry on loan applications. It includes key metric cards, a 6-tab data entry interface, document verification, and eligibility calculation.</w:t>
+      </w:r>
+    </w:p>
+    <w:p>
+      <w:pPr>
+        <w:pStyle w:val="Heading3"/>
+      </w:pPr>
+      <w:r>
+        <w:t xml:space="preserve">Key Features</w:t>
+      </w:r>
+    </w:p>
+    <w:p>
+      <w:pPr>
+        <w:pStyle w:val="ListBullet"/>
+        <w:spacing w:after="60"/>
+      </w:pPr>
+      <w:r>
+        <w:rPr>
+          <w:rFonts w:ascii="Calibri" w:hAnsi="Calibri"/>
+          <w:sz w:val="20"/>
+        </w:rPr>
+        <w:t xml:space="preserve">Loan header bar with key identifiers (Loan ID, Lender, Deal ID, Employment Type, Outstanding)</w:t>
+      </w:r>
+    </w:p>
+    <w:p>
+      <w:pPr>
+        <w:pStyle w:val="ListBullet"/>
+        <w:spacing w:after="60"/>
+      </w:pPr>
+      <w:r>
+        <w:rPr>
+          <w:rFonts w:ascii="Calibri" w:hAnsi="Calibri"/>
+          <w:sz w:val="20"/>
+        </w:rPr>
+        <w:t xml:space="preserve">4 metric cards: LTV ratio, FOIR, CIBIL Score, EMI/NMI ratio with status icons</w:t>
+      </w:r>
+    </w:p>
+    <w:p>
+      <w:pPr>
+        <w:pStyle w:val="ListBullet"/>
+        <w:spacing w:after="60"/>
+      </w:pPr>
+      <w:r>
+        <w:rPr>
+          <w:rFonts w:ascii="Calibri" w:hAnsi="Calibri"/>
+          <w:sz w:val="20"/>
+        </w:rPr>
+        <w:t xml:space="preserve">6-tab data entry: Loan Chars, General Data, Employment, Income Details, Banking, Obligations</w:t>
+      </w:r>
+    </w:p>
+    <w:p>
+      <w:pPr>
+        <w:pStyle w:val="ListBullet"/>
+        <w:spacing w:after="60"/>
+      </w:pPr>
+      <w:r>
+        <w:rPr>
+          <w:rFonts w:ascii="Calibri" w:hAnsi="Calibri"/>
+          <w:sz w:val="20"/>
+        </w:rPr>
+        <w:t xml:space="preserve">Documents sidebar with per-document Approved/Pending status checklist</w:t>
+      </w:r>
+    </w:p>
+    <w:p>
+      <w:pPr>
+        <w:pStyle w:val="ListBullet"/>
+        <w:spacing w:after="60"/>
+      </w:pPr>
+      <w:r>
+        <w:rPr>
+          <w:rFonts w:ascii="Calibri" w:hAnsi="Calibri"/>
+          <w:sz w:val="20"/>
+        </w:rPr>
+        <w:t xml:space="preserve">Eligibility sidebar showing Max Eligible, Applied, and Buffer amounts</w:t>
+      </w:r>
+    </w:p>
+    <w:p>
+      <w:pPr>
+        <w:pStyle w:val="ListBullet"/>
+        <w:spacing w:after="60"/>
+      </w:pPr>
+      <w:r>
+        <w:rPr>
+          <w:rFonts w:ascii="Calibri" w:hAnsi="Calibri"/>
+          <w:sz w:val="20"/>
+        </w:rPr>
+        <w:t xml:space="preserve">Remarks/Case Notes textarea with save functionality</w:t>
+      </w:r>
+    </w:p>
+    <w:p>
+      <w:pPr>
+        <w:pStyle w:val="ListBullet"/>
+        <w:spacing w:after="60"/>
+      </w:pPr>
+      <w:r>
+        <w:rPr>
+          <w:rFonts w:ascii="Calibri" w:hAnsi="Calibri"/>
+          <w:sz w:val="20"/>
+        </w:rPr>
+        <w:t xml:space="preserve">Sticky footer with Save and Submit to Underwriting action buttons</w:t>
+      </w:r>
+    </w:p>
+    <w:p>
+      <w:r>
+        <w:t xml:space="preserve"/>
+      </w:r>
+    </w:p>
+    <w:p>
+      <w:pPr>
+        <w:pStyle w:val="Heading1"/>
+      </w:pPr>
+      <w:r>
+        <w:t xml:space="preserve">17. Finance</w:t>
+      </w:r>
+    </w:p>
+    <w:p>
+      <w:r>
+        <w:t xml:space="preserve"/>
+      </w:r>
+    </w:p>
+    <w:p>
+      <w:pPr>
+        <w:pStyle w:val="Heading2"/>
+      </w:pPr>
+      <w:r>
+        <w:t xml:space="preserve">Overview</w:t>
+      </w:r>
+    </w:p>
+    <w:p>
+      <w:r>
+        <w:t xml:space="preserve">The Finance module manages invoicing, payment tracking, and bank reconciliation for mortgage guarantee operations. It provides KPI dashboards and multi-tab interfaces for financial management.</w:t>
+      </w:r>
+    </w:p>
+    <w:p>
+      <w:pPr>
+        <w:pStyle w:val="Heading3"/>
+      </w:pPr>
+      <w:r>
+        <w:t xml:space="preserve">Key Features</w:t>
+      </w:r>
+    </w:p>
+    <w:p>
+      <w:pPr>
+        <w:pStyle w:val="ListBullet"/>
+        <w:spacing w:after="60"/>
+      </w:pPr>
+      <w:r>
+        <w:rPr>
+          <w:rFonts w:ascii="Calibri" w:hAnsi="Calibri"/>
+          <w:sz w:val="20"/>
+        </w:rPr>
+        <w:t xml:space="preserve">4 KPI cards: Total Revenue, Outstanding, Collected, Reconciled percentage</w:t>
+      </w:r>
+    </w:p>
+    <w:p>
+      <w:pPr>
+        <w:pStyle w:val="ListBullet"/>
+        <w:spacing w:after="60"/>
+      </w:pPr>
+      <w:r>
+        <w:rPr>
+          <w:rFonts w:ascii="Calibri" w:hAnsi="Calibri"/>
+          <w:sz w:val="20"/>
+        </w:rPr>
+        <w:t xml:space="preserve">Invoices tab: Invoice table with ID, Lender, Deal, Type, Amount, Status, Date</w:t>
+      </w:r>
+    </w:p>
+    <w:p>
+      <w:pPr>
+        <w:pStyle w:val="ListBullet"/>
+        <w:spacing w:after="60"/>
+      </w:pPr>
+      <w:r>
+        <w:rPr>
+          <w:rFonts w:ascii="Calibri" w:hAnsi="Calibri"/>
+          <w:sz w:val="20"/>
+        </w:rPr>
+        <w:t xml:space="preserve">Payments tab: Payment records with method, reference, and status tracking</w:t>
+      </w:r>
+    </w:p>
+    <w:p>
+      <w:pPr>
+        <w:pStyle w:val="ListBullet"/>
+        <w:spacing w:after="60"/>
+      </w:pPr>
+      <w:r>
+        <w:rPr>
+          <w:rFonts w:ascii="Calibri" w:hAnsi="Calibri"/>
+          <w:sz w:val="20"/>
+        </w:rPr>
+        <w:t xml:space="preserve">Reconciliation tab: Bank reconciliation with match status and variance tracking</w:t>
+      </w:r>
+    </w:p>
+    <w:p>
+      <w:pPr>
+        <w:pStyle w:val="ListBullet"/>
+        <w:spacing w:after="60"/>
+      </w:pPr>
+      <w:r>
+        <w:rPr>
+          <w:rFonts w:ascii="Calibri" w:hAnsi="Calibri"/>
+          <w:sz w:val="20"/>
+        </w:rPr>
+        <w:t xml:space="preserve">Generate Invoice action button for new invoice creation</w:t>
+      </w:r>
+    </w:p>
+    <w:p>
+      <w:r>
+        <w:t xml:space="preserve"/>
+      </w:r>
+    </w:p>
+    <w:p>
+      <w:pPr>
+        <w:pStyle w:val="Heading1"/>
+      </w:pPr>
+      <w:r>
+        <w:t xml:space="preserve">18. Servicing</w:t>
+      </w:r>
+    </w:p>
+    <w:p>
+      <w:r>
+        <w:t xml:space="preserve"/>
+      </w:r>
+    </w:p>
+    <w:p>
+      <w:pPr>
+        <w:pStyle w:val="Heading2"/>
+      </w:pPr>
+      <w:r>
+        <w:t xml:space="preserve">Overview</w:t>
+      </w:r>
+    </w:p>
+    <w:p>
+      <w:r>
+        <w:t xml:space="preserve">The Servicing module handles loan servicing data management including bulk file uploads, NPA (Non-Performing Asset) tracking, delinquency monitoring, and premium payment verification.</w:t>
+      </w:r>
+    </w:p>
+    <w:p>
+      <w:pPr>
+        <w:pStyle w:val="Heading3"/>
+      </w:pPr>
+      <w:r>
+        <w:t xml:space="preserve">Key Features</w:t>
+      </w:r>
+    </w:p>
+    <w:p>
+      <w:pPr>
+        <w:pStyle w:val="ListBullet"/>
+        <w:spacing w:after="60"/>
+      </w:pPr>
+      <w:r>
+        <w:rPr>
+          <w:rFonts w:ascii="Calibri" w:hAnsi="Calibri"/>
+          <w:sz w:val="20"/>
+        </w:rPr>
+        <w:t xml:space="preserve">File Upload tab: Servicing file upload with Lender Name, Month, Batch ID, and file selector</w:t>
+      </w:r>
+    </w:p>
+    <w:p>
+      <w:pPr>
+        <w:pStyle w:val="ListBullet"/>
+        <w:spacing w:after="60"/>
+      </w:pPr>
+      <w:r>
+        <w:rPr>
+          <w:rFonts w:ascii="Calibri" w:hAnsi="Calibri"/>
+          <w:sz w:val="20"/>
+        </w:rPr>
+        <w:t xml:space="preserve">NPA Tracking tab: Non-Performing Asset tracking with classification and provisioning</w:t>
+      </w:r>
+    </w:p>
+    <w:p>
+      <w:pPr>
+        <w:pStyle w:val="ListBullet"/>
+        <w:spacing w:after="60"/>
+      </w:pPr>
+      <w:r>
+        <w:rPr>
+          <w:rFonts w:ascii="Calibri" w:hAnsi="Calibri"/>
+          <w:sz w:val="20"/>
+        </w:rPr>
+        <w:t xml:space="preserve">Delinquency tab: Delinquency metrics with DPD (Days Past Due) buckets and trends</w:t>
+      </w:r>
+    </w:p>
+    <w:p>
+      <w:pPr>
+        <w:pStyle w:val="ListBullet"/>
+        <w:spacing w:after="60"/>
+      </w:pPr>
+      <w:r>
+        <w:rPr>
+          <w:rFonts w:ascii="Calibri" w:hAnsi="Calibri"/>
+          <w:sz w:val="20"/>
+        </w:rPr>
+        <w:t xml:space="preserve">Data Analysis tab: Uploaded file analysis results with validation status</w:t>
+      </w:r>
+    </w:p>
+    <w:p>
+      <w:pPr>
+        <w:pStyle w:val="ListBullet"/>
+        <w:spacing w:after="60"/>
+      </w:pPr>
+      <w:r>
+        <w:rPr>
+          <w:rFonts w:ascii="Calibri" w:hAnsi="Calibri"/>
+          <w:sz w:val="20"/>
+        </w:rPr>
+        <w:t xml:space="preserve">Premium Check tab: Premium payment verification and status monitoring</w:t>
+      </w:r>
+    </w:p>
+    <w:p>
+      <w:r>
+        <w:t xml:space="preserve"/>
+      </w:r>
+    </w:p>
+    <w:p>
+      <w:pPr>
+        <w:pStyle w:val="Heading1"/>
+      </w:pPr>
+      <w:r>
+        <w:t xml:space="preserve">19. Master Setup</w:t>
+      </w:r>
+    </w:p>
+    <w:p>
+      <w:r>
+        <w:t xml:space="preserve"/>
+      </w:r>
+    </w:p>
+    <w:p>
+      <w:pPr>
+        <w:pStyle w:val="Heading2"/>
+      </w:pPr>
+      <w:r>
+        <w:t xml:space="preserve">Overview</w:t>
+      </w:r>
+    </w:p>
+    <w:p>
+      <w:r>
+        <w:t xml:space="preserve">The Master Setup module provides a centralized configuration hub with 14 configuration areas for managing system-wide settings, master data, and operational parameters.</w:t>
+      </w:r>
+    </w:p>
+    <w:p>
+      <w:pPr>
+        <w:pStyle w:val="Heading3"/>
+      </w:pPr>
+      <w:r>
+        <w:t xml:space="preserve">Configuration Cards</w:t>
+      </w:r>
+    </w:p>
+    <w:p>
+      <w:pPr>
+        <w:pStyle w:val="ListBullet"/>
+        <w:spacing w:after="60"/>
+      </w:pPr>
+      <w:r>
+        <w:rPr>
+          <w:rFonts w:ascii="Calibri" w:hAnsi="Calibri"/>
+          <w:sz w:val="20"/>
+        </w:rPr>
+        <w:t xml:space="preserve">Lender Setup, Deal Setup, Scheme Setup, Pricing Upload</w:t>
+      </w:r>
+    </w:p>
+    <w:p>
+      <w:pPr>
+        <w:pStyle w:val="ListBullet"/>
+        <w:spacing w:after="60"/>
+      </w:pPr>
+      <w:r>
+        <w:rPr>
+          <w:rFonts w:ascii="Calibri" w:hAnsi="Calibri"/>
+          <w:sz w:val="20"/>
+        </w:rPr>
+        <w:t xml:space="preserve">Template Management, Role Management, Workflow Config, Builder/Project Master</w:t>
+      </w:r>
+    </w:p>
+    <w:p>
+      <w:pPr>
+        <w:pStyle w:val="ListBullet"/>
+        <w:spacing w:after="60"/>
+      </w:pPr>
+      <w:r>
+        <w:rPr>
+          <w:rFonts w:ascii="Calibri" w:hAnsi="Calibri"/>
+          <w:sz w:val="20"/>
+        </w:rPr>
+        <w:t xml:space="preserve">City Classification, Vendor Mapping, Deviation Master, Collateral Master</w:t>
+      </w:r>
+    </w:p>
+    <w:p>
+      <w:pPr>
+        <w:pStyle w:val="ListBullet"/>
+        <w:spacing w:after="60"/>
+      </w:pPr>
+      <w:r>
+        <w:rPr>
+          <w:rFonts w:ascii="Calibri" w:hAnsi="Calibri"/>
+          <w:sz w:val="20"/>
+        </w:rPr>
+        <w:t xml:space="preserve">Regulatory Compliance, System Settings</w:t>
+      </w:r>
+    </w:p>
+    <w:p>
+      <w:pPr>
+        <w:pStyle w:val="ListBullet"/>
+        <w:spacing w:after="60"/>
+      </w:pPr>
+      <w:r>
+        <w:rPr>
+          <w:rFonts w:ascii="Calibri" w:hAnsi="Calibri"/>
+          <w:sz w:val="20"/>
+        </w:rPr>
+        <w:t xml:space="preserve">Each card displays: icon, title, description, and active record count</w:t>
+      </w:r>
+    </w:p>
+    <w:p>
+      <w:r>
+        <w:t xml:space="preserve"/>
+      </w:r>
+    </w:p>
+    <w:p>
+      <w:pPr>
+        <w:pStyle w:val="Heading1"/>
+      </w:pPr>
+      <w:r>
+        <w:t xml:space="preserve">20. Audit Logs</w:t>
+      </w:r>
+    </w:p>
+    <w:p>
+      <w:r>
+        <w:t xml:space="preserve"/>
+      </w:r>
+    </w:p>
+    <w:p>
+      <w:pPr>
+        <w:pStyle w:val="Heading2"/>
+      </w:pPr>
+      <w:r>
+        <w:t xml:space="preserve">Overview</w:t>
+      </w:r>
+    </w:p>
+    <w:p>
+      <w:r>
+        <w:t xml:space="preserve">The Audit Logs module provides comprehensive field-level change tracking across all system modules. It enables administrators to trace every modification with old and new values, filter by module or date range, and export logs.</w:t>
+      </w:r>
+    </w:p>
+    <w:p>
+      <w:pPr>
+        <w:pStyle w:val="Heading3"/>
+      </w:pPr>
+      <w:r>
+        <w:t xml:space="preserve">Key Features</w:t>
+      </w:r>
+    </w:p>
+    <w:p>
+      <w:pPr>
+        <w:pStyle w:val="ListBullet"/>
+        <w:spacing w:after="60"/>
+      </w:pPr>
+      <w:r>
+        <w:rPr>
+          <w:rFonts w:ascii="Calibri" w:hAnsi="Calibri"/>
+          <w:sz w:val="20"/>
+        </w:rPr>
+        <w:t xml:space="preserve">Field-level change tracking with visual diff: old value (red strikethrough) → new value (green)</w:t>
+      </w:r>
+    </w:p>
+    <w:p>
+      <w:pPr>
+        <w:pStyle w:val="ListBullet"/>
+        <w:spacing w:after="60"/>
+      </w:pPr>
+      <w:r>
+        <w:rPr>
+          <w:rFonts w:ascii="Calibri" w:hAnsi="Calibri"/>
+          <w:sz w:val="20"/>
+        </w:rPr>
+        <w:t xml:space="preserve">Module filter dropdown: Underwriting, DDE, QDE, Workflow, Claims, Policy, etc.</w:t>
+      </w:r>
+    </w:p>
+    <w:p>
+      <w:pPr>
+        <w:pStyle w:val="ListBullet"/>
+        <w:spacing w:after="60"/>
+      </w:pPr>
+      <w:r>
+        <w:rPr>
+          <w:rFonts w:ascii="Calibri" w:hAnsi="Calibri"/>
+          <w:sz w:val="20"/>
+        </w:rPr>
+        <w:t xml:space="preserve">Date range filter for narrowing log timeframes</w:t>
+      </w:r>
+    </w:p>
+    <w:p>
+      <w:pPr>
+        <w:pStyle w:val="ListBullet"/>
+        <w:spacing w:after="60"/>
+      </w:pPr>
+      <w:r>
+        <w:rPr>
+          <w:rFonts w:ascii="Calibri" w:hAnsi="Calibri"/>
+          <w:sz w:val="20"/>
+        </w:rPr>
+        <w:t xml:space="preserve">Free-text search across all log fields (user, module, field, values)</w:t>
+      </w:r>
+    </w:p>
+    <w:p>
+      <w:pPr>
+        <w:pStyle w:val="ListBullet"/>
+        <w:spacing w:after="60"/>
+      </w:pPr>
+      <w:r>
+        <w:rPr>
+          <w:rFonts w:ascii="Calibri" w:hAnsi="Calibri"/>
+          <w:sz w:val="20"/>
+        </w:rPr>
+        <w:t xml:space="preserve">CSV export of filtered audit data</w:t>
+      </w:r>
+    </w:p>
+    <w:p>
+      <w:pPr>
+        <w:pStyle w:val="ListBullet"/>
+        <w:spacing w:after="60"/>
+      </w:pPr>
+      <w:r>
+        <w:rPr>
+          <w:rFonts w:ascii="Calibri" w:hAnsi="Calibri"/>
+          <w:sz w:val="20"/>
+        </w:rPr>
+        <w:t xml:space="preserve">Table columns: Timestamp, User, Module, Field, Old Value, New Value, Record ID</w:t>
+      </w:r>
+    </w:p>
+    <w:p>
+      <w:r>
+        <w:t xml:space="preserve"/>
+      </w:r>
+    </w:p>
+    <w:p>
+      <w:pPr>
+        <w:pStyle w:val="Heading1"/>
+      </w:pPr>
+      <w:r>
+        <w:t>21. Technology Stack &amp; Architecture</w:t>
       </w:r>
     </w:p>
     <w:p>
@@ -8975,7 +9711,7 @@
         <w:pStyle w:val="Heading1"/>
       </w:pPr>
       <w:r>
-        <w:t>16. User Roles &amp; Permissions</w:t>
+        <w:t>22. User Roles &amp; Permissions</w:t>
       </w:r>
     </w:p>
     <w:p>
@@ -10327,7 +11063,7 @@
         <w:pStyle w:val="Heading1"/>
       </w:pPr>
       <w:r>
-        <w:t>17. Navigation Reference</w:t>
+        <w:t>23. Navigation Reference</w:t>
       </w:r>
     </w:p>
     <w:p>
@@ -11309,7 +12045,7 @@
         <w:pStyle w:val="Heading1"/>
       </w:pPr>
       <w:r>
-        <w:t>18. API Endpoints Reference</w:t>
+        <w:t>24. API Endpoints Reference</w:t>
       </w:r>
     </w:p>
     <w:p>

</xml_diff>